<commit_message>
feat(academy): implement GCS asset pipeline, theme matching, error fallbacks, and update coin count
</commit_message>
<xml_diff>
--- a/1 NUMISTA.AI/Individual Pages of Numista.ai/Sidebar/Sidebar.docx
+++ b/1 NUMISTA.AI/Individual Pages of Numista.ai/Sidebar/Sidebar.docx
@@ -28,17 +28,54 @@
       </w:r>
       <w:proofErr w:type="gramEnd"/>
       <w:r>
-        <w:t xml:space="preserve">Coins’, ‘Currency’, </w:t>
-      </w:r>
-      <w:r>
-        <w:t>‘World and Specialty’</w:t>
-      </w:r>
-      <w:r>
-        <w:t xml:space="preserve"> &amp; ‘All’ (if that is possible).</w:t>
+        <w:t>Coins</w:t>
+      </w:r>
+      <w:proofErr w:type="gramStart"/>
+      <w:r>
+        <w:t>’, ‘</w:t>
+      </w:r>
+      <w:proofErr w:type="gramEnd"/>
+      <w:r>
+        <w:t>Currency</w:t>
+      </w:r>
+      <w:proofErr w:type="gramStart"/>
+      <w:r>
+        <w:t xml:space="preserve">’, </w:t>
+      </w:r>
+      <w:r>
+        <w:t>‘</w:t>
+      </w:r>
+      <w:proofErr w:type="gramEnd"/>
+      <w:r>
+        <w:t>World and Specialty</w:t>
+      </w:r>
+      <w:proofErr w:type="gramStart"/>
+      <w:r>
+        <w:t>’</w:t>
+      </w:r>
+      <w:r>
+        <w:t xml:space="preserve"> &amp; ‘</w:t>
+      </w:r>
+      <w:proofErr w:type="gramEnd"/>
+      <w:r>
+        <w:t>All’ (if that is possible).</w:t>
       </w:r>
       <w:r>
         <w:br/>
-        <w:t xml:space="preserve">     a. So, ‘Currency Collection’, ‘World and Specialty’ under the new ‘My Collection’ </w:t>
+        <w:t xml:space="preserve">     a. So, </w:t>
+      </w:r>
+      <w:r>
+        <w:t xml:space="preserve">on the Sidebar, move </w:t>
+      </w:r>
+      <w:r>
+        <w:t>‘Currency Collection’, ‘World and Specialty’ under the new ‘My Collection’</w:t>
+      </w:r>
+      <w:r>
+        <w:t>.</w:t>
+      </w:r>
+      <w:r>
+        <w:br/>
+        <w:t xml:space="preserve">     b. Also move ‘Inventory’ under my collection.</w:t>
       </w:r>
     </w:p>
     <w:p>
@@ -47,20 +84,11 @@
       </w:r>
       <w:r>
         <w:br/>
-        <w:t xml:space="preserve">     a. Move ‘Microscope Scanner’ under ‘</w:t>
-      </w:r>
-      <w:r>
-        <w:t>‘Add new coins/notes/etc.</w:t>
-      </w:r>
-      <w:r>
-        <w:t>”</w:t>
+        <w:t xml:space="preserve">     a. Move ‘Microscope Scanner’ under ‘‘Add new coins/notes/etc.”</w:t>
       </w:r>
       <w:r>
         <w:br/>
-        <w:t xml:space="preserve">     b. Move ‘Review Hub’ under </w:t>
-      </w:r>
-      <w:r>
-        <w:t>‘Add new coins/notes/etc.’</w:t>
+        <w:t xml:space="preserve">     b. Move ‘Review Hub’ under ‘Add new coins/notes/etc.’</w:t>
       </w:r>
     </w:p>
     <w:p>
@@ -80,6 +108,31 @@
       </w:r>
       <w:r>
         <w:t>, as well.</w:t>
+      </w:r>
+    </w:p>
+    <w:p>
+      <w:r>
+        <w:t xml:space="preserve">4. Make a new category called </w:t>
+      </w:r>
+      <w:proofErr w:type="spellStart"/>
+      <w:r>
+        <w:t>Numistic</w:t>
+      </w:r>
+      <w:proofErr w:type="spellEnd"/>
+      <w:r>
+        <w:t xml:space="preserve"> Research</w:t>
+      </w:r>
+      <w:r>
+        <w:br/>
+        <w:t xml:space="preserve">    A. Put ‘Error Library’, Glossary Academy’, ‘Coin Search’ and ‘AI </w:t>
+      </w:r>
+      <w:proofErr w:type="spellStart"/>
+      <w:r>
+        <w:t>Deepdive</w:t>
+      </w:r>
+      <w:proofErr w:type="spellEnd"/>
+      <w:r>
+        <w:t>’ under that category.</w:t>
       </w:r>
     </w:p>
     <w:sectPr>

</xml_diff>